<commit_message>
Remove Render deployment files and screenshot images
</commit_message>
<xml_diff>
--- a/gadash_README.docx
+++ b/gadash_README.docx
@@ -6,6 +6,7 @@
       <w:pPr>
         <w:bidi/>
       </w:pPr>
+      <w:proofErr w:type="spellStart"/>
       <w:r>
         <w:rPr>
           <w:b/>
@@ -13,7 +14,305 @@
           <w:sz w:val="36"/>
           <w:rtl/>
         </w:rPr>
-        <w:t>שם הפרויקט: בוט ניהול עבודות גד״ש</w:t>
+        <w:t>שם</w:t>
+      </w:r>
+      <w:proofErr w:type="spellEnd"/>
+      <w:r>
+        <w:rPr>
+          <w:b/>
+          <w:color w:val="1E3A5F"/>
+          <w:sz w:val="36"/>
+          <w:rtl/>
+        </w:rPr>
+        <w:t xml:space="preserve"> </w:t>
+      </w:r>
+      <w:proofErr w:type="spellStart"/>
+      <w:r>
+        <w:rPr>
+          <w:b/>
+          <w:color w:val="1E3A5F"/>
+          <w:sz w:val="36"/>
+          <w:rtl/>
+        </w:rPr>
+        <w:t>הפרויקט</w:t>
+      </w:r>
+      <w:proofErr w:type="spellEnd"/>
+      <w:r>
+        <w:rPr>
+          <w:b/>
+          <w:color w:val="1E3A5F"/>
+          <w:sz w:val="36"/>
+          <w:rtl/>
+        </w:rPr>
+        <w:t xml:space="preserve">: </w:t>
+      </w:r>
+      <w:proofErr w:type="spellStart"/>
+      <w:r>
+        <w:rPr>
+          <w:b/>
+          <w:color w:val="1E3A5F"/>
+          <w:sz w:val="36"/>
+          <w:rtl/>
+        </w:rPr>
+        <w:t>בוט</w:t>
+      </w:r>
+      <w:proofErr w:type="spellEnd"/>
+      <w:r>
+        <w:rPr>
+          <w:b/>
+          <w:color w:val="1E3A5F"/>
+          <w:sz w:val="36"/>
+          <w:rtl/>
+        </w:rPr>
+        <w:t xml:space="preserve"> </w:t>
+      </w:r>
+      <w:proofErr w:type="spellStart"/>
+      <w:r>
+        <w:rPr>
+          <w:b/>
+          <w:color w:val="1E3A5F"/>
+          <w:sz w:val="36"/>
+          <w:rtl/>
+        </w:rPr>
+        <w:t>ניהול</w:t>
+      </w:r>
+      <w:proofErr w:type="spellEnd"/>
+      <w:r>
+        <w:rPr>
+          <w:b/>
+          <w:color w:val="1E3A5F"/>
+          <w:sz w:val="36"/>
+          <w:rtl/>
+        </w:rPr>
+        <w:t xml:space="preserve"> </w:t>
+      </w:r>
+      <w:proofErr w:type="spellStart"/>
+      <w:r>
+        <w:rPr>
+          <w:b/>
+          <w:color w:val="1E3A5F"/>
+          <w:sz w:val="36"/>
+          <w:rtl/>
+        </w:rPr>
+        <w:t>עבודות</w:t>
+      </w:r>
+      <w:proofErr w:type="spellEnd"/>
+      <w:r>
+        <w:rPr>
+          <w:b/>
+          <w:color w:val="1E3A5F"/>
+          <w:sz w:val="36"/>
+          <w:rtl/>
+        </w:rPr>
+        <w:t xml:space="preserve"> </w:t>
+      </w:r>
+      <w:proofErr w:type="spellStart"/>
+      <w:r>
+        <w:rPr>
+          <w:b/>
+          <w:color w:val="1E3A5F"/>
+          <w:sz w:val="36"/>
+          <w:rtl/>
+        </w:rPr>
+        <w:t>גד״ש</w:t>
+      </w:r>
+      <w:proofErr w:type="spellEnd"/>
+    </w:p>
+    <w:p>
+      <w:pPr>
+        <w:jc w:val="right"/>
+      </w:pPr>
+    </w:p>
+    <w:p>
+      <w:pPr>
+        <w:bidi/>
+      </w:pPr>
+      <w:proofErr w:type="spellStart"/>
+      <w:r>
+        <w:rPr>
+          <w:sz w:val="24"/>
+          <w:rtl/>
+        </w:rPr>
+        <w:t>קורס</w:t>
+      </w:r>
+      <w:proofErr w:type="spellEnd"/>
+      <w:r>
+        <w:rPr>
+          <w:sz w:val="24"/>
+          <w:rtl/>
+        </w:rPr>
+        <w:t xml:space="preserve">: </w:t>
+      </w:r>
+      <w:proofErr w:type="spellStart"/>
+      <w:r>
+        <w:rPr>
+          <w:sz w:val="24"/>
+          <w:rtl/>
+        </w:rPr>
+        <w:t>נושאים</w:t>
+      </w:r>
+      <w:proofErr w:type="spellEnd"/>
+      <w:r>
+        <w:rPr>
+          <w:sz w:val="24"/>
+          <w:rtl/>
+        </w:rPr>
+        <w:t xml:space="preserve"> </w:t>
+      </w:r>
+      <w:proofErr w:type="spellStart"/>
+      <w:r>
+        <w:rPr>
+          <w:sz w:val="24"/>
+          <w:rtl/>
+        </w:rPr>
+        <w:t>מתקדמים</w:t>
+      </w:r>
+      <w:proofErr w:type="spellEnd"/>
+      <w:r>
+        <w:rPr>
+          <w:sz w:val="24"/>
+          <w:rtl/>
+        </w:rPr>
+        <w:t xml:space="preserve"> </w:t>
+      </w:r>
+      <w:proofErr w:type="spellStart"/>
+      <w:r>
+        <w:rPr>
+          <w:sz w:val="24"/>
+          <w:rtl/>
+        </w:rPr>
+        <w:t>בפיתוח</w:t>
+      </w:r>
+      <w:proofErr w:type="spellEnd"/>
+      <w:r>
+        <w:rPr>
+          <w:sz w:val="24"/>
+          <w:rtl/>
+        </w:rPr>
+        <w:t xml:space="preserve"> </w:t>
+      </w:r>
+      <w:proofErr w:type="spellStart"/>
+      <w:r>
+        <w:rPr>
+          <w:sz w:val="24"/>
+          <w:rtl/>
+        </w:rPr>
+        <w:t>תוכנה</w:t>
+      </w:r>
+      <w:proofErr w:type="spellEnd"/>
+    </w:p>
+    <w:p>
+      <w:pPr>
+        <w:bidi/>
+        <w:rPr>
+          <w:rFonts w:hint="cs"/>
+          <w:lang w:bidi="he-IL"/>
+        </w:rPr>
+      </w:pPr>
+      <w:proofErr w:type="spellStart"/>
+      <w:r>
+        <w:rPr>
+          <w:sz w:val="24"/>
+          <w:rtl/>
+        </w:rPr>
+        <w:t>מרצה</w:t>
+      </w:r>
+      <w:proofErr w:type="spellEnd"/>
+      <w:r>
+        <w:rPr>
+          <w:sz w:val="24"/>
+          <w:rtl/>
+        </w:rPr>
+        <w:t xml:space="preserve">: </w:t>
+      </w:r>
+      <w:proofErr w:type="spellStart"/>
+      <w:r>
+        <w:rPr>
+          <w:sz w:val="24"/>
+          <w:rtl/>
+        </w:rPr>
+        <w:t>ד״ר</w:t>
+      </w:r>
+      <w:proofErr w:type="spellEnd"/>
+      <w:r>
+        <w:rPr>
+          <w:sz w:val="24"/>
+          <w:rtl/>
+        </w:rPr>
+        <w:t xml:space="preserve"> </w:t>
+      </w:r>
+      <w:proofErr w:type="spellStart"/>
+      <w:r>
+        <w:rPr>
+          <w:sz w:val="24"/>
+          <w:rtl/>
+        </w:rPr>
+        <w:t>איאד</w:t>
+      </w:r>
+      <w:proofErr w:type="spellEnd"/>
+      <w:r>
+        <w:rPr>
+          <w:sz w:val="24"/>
+          <w:rtl/>
+        </w:rPr>
+        <w:t xml:space="preserve"> </w:t>
+      </w:r>
+      <w:proofErr w:type="spellStart"/>
+      <w:r>
+        <w:rPr>
+          <w:sz w:val="24"/>
+          <w:rtl/>
+        </w:rPr>
+        <w:t>סולימאן</w:t>
+      </w:r>
+      <w:proofErr w:type="spellEnd"/>
+      <w:r>
+        <w:rPr>
+          <w:sz w:val="24"/>
+          <w:rtl/>
+        </w:rPr>
+        <w:t xml:space="preserve"> | </w:t>
+      </w:r>
+      <w:proofErr w:type="spellStart"/>
+      <w:r>
+        <w:rPr>
+          <w:sz w:val="24"/>
+          <w:rtl/>
+        </w:rPr>
+        <w:t>סמסטר</w:t>
+      </w:r>
+      <w:proofErr w:type="spellEnd"/>
+      <w:r>
+        <w:rPr>
+          <w:sz w:val="24"/>
+          <w:rtl/>
+        </w:rPr>
+        <w:t xml:space="preserve"> ב׳ </w:t>
+      </w:r>
+      <w:proofErr w:type="spellStart"/>
+      <w:r>
+        <w:rPr>
+          <w:sz w:val="24"/>
+          <w:rtl/>
+        </w:rPr>
+        <w:t>תשפ</w:t>
+      </w:r>
+      <w:proofErr w:type="spellEnd"/>
+      <w:r>
+        <w:rPr>
+          <w:sz w:val="24"/>
+          <w:rtl/>
+        </w:rPr>
+        <w:t>״</w:t>
+      </w:r>
+      <w:r>
+        <w:rPr>
+          <w:rFonts w:hint="cs"/>
+          <w:sz w:val="24"/>
+          <w:rtl/>
+          <w:lang w:bidi="he-IL"/>
+        </w:rPr>
+        <w:t>ו</w:t>
       </w:r>
     </w:p>
     <w:p>
@@ -25,24 +324,200 @@
       <w:pPr>
         <w:bidi/>
       </w:pPr>
+      <w:proofErr w:type="spellStart"/>
       <w:r>
         <w:rPr>
+          <w:b/>
+          <w:color w:val="1E3A5F"/>
+          <w:sz w:val="28"/>
+          <w:rtl/>
+        </w:rPr>
+        <w:t>שותפים</w:t>
+      </w:r>
+      <w:proofErr w:type="spellEnd"/>
+      <w:r>
+        <w:rPr>
+          <w:b/>
+          <w:color w:val="1E3A5F"/>
+          <w:sz w:val="28"/>
+          <w:rtl/>
+        </w:rPr>
+        <w:t xml:space="preserve"> </w:t>
+      </w:r>
+      <w:proofErr w:type="spellStart"/>
+      <w:r>
+        <w:rPr>
+          <w:b/>
+          <w:color w:val="1E3A5F"/>
+          <w:sz w:val="28"/>
+          <w:rtl/>
+        </w:rPr>
+        <w:t>בפרויקט</w:t>
+      </w:r>
+      <w:proofErr w:type="spellEnd"/>
+    </w:p>
+    <w:p>
+      <w:pPr>
+        <w:jc w:val="right"/>
+      </w:pPr>
+    </w:p>
+    <w:p>
+      <w:pPr>
+        <w:bidi/>
+      </w:pPr>
+      <w:proofErr w:type="spellStart"/>
+      <w:r>
+        <w:rPr>
+          <w:b/>
           <w:sz w:val="24"/>
           <w:rtl/>
         </w:rPr>
-        <w:t>קורס: נושאים מתקדמים בפיתוח תוכנה</w:t>
+        <w:t>שותף</w:t>
+      </w:r>
+      <w:proofErr w:type="spellEnd"/>
+      <w:r>
+        <w:rPr>
+          <w:b/>
+          <w:sz w:val="24"/>
+          <w:rtl/>
+        </w:rPr>
+        <w:t xml:space="preserve"> 1</w:t>
       </w:r>
     </w:p>
     <w:p>
       <w:pPr>
         <w:bidi/>
       </w:pPr>
+      <w:proofErr w:type="spellStart"/>
       <w:r>
         <w:rPr>
           <w:sz w:val="24"/>
           <w:rtl/>
         </w:rPr>
-        <w:t>מרצה: ד״ר איאד סולימאן | סמסטר ב׳ תשפ״ה</w:t>
+        <w:t>שם</w:t>
+      </w:r>
+      <w:proofErr w:type="spellEnd"/>
+      <w:r>
+        <w:rPr>
+          <w:sz w:val="24"/>
+          <w:rtl/>
+        </w:rPr>
+        <w:t xml:space="preserve">: </w:t>
+      </w:r>
+      <w:r>
+        <w:rPr>
+          <w:rFonts w:hint="cs"/>
+          <w:sz w:val="24"/>
+          <w:rtl/>
+          <w:lang w:bidi="he-IL"/>
+        </w:rPr>
+        <w:t>ע</w:t>
+      </w:r>
+      <w:proofErr w:type="spellStart"/>
+      <w:r>
+        <w:rPr>
+          <w:sz w:val="24"/>
+          <w:rtl/>
+        </w:rPr>
+        <w:t>מית</w:t>
+      </w:r>
+      <w:proofErr w:type="spellEnd"/>
+      <w:r>
+        <w:rPr>
+          <w:sz w:val="24"/>
+          <w:rtl/>
+        </w:rPr>
+        <w:t xml:space="preserve"> </w:t>
+      </w:r>
+      <w:proofErr w:type="spellStart"/>
+      <w:r>
+        <w:rPr>
+          <w:sz w:val="24"/>
+          <w:rtl/>
+        </w:rPr>
+        <w:t>גינזב</w:t>
+      </w:r>
+      <w:proofErr w:type="spellEnd"/>
+      <w:r>
+        <w:rPr>
+          <w:rFonts w:hint="cs"/>
+          <w:sz w:val="24"/>
+          <w:rtl/>
+          <w:lang w:bidi="he-IL"/>
+        </w:rPr>
+        <w:t>ו</w:t>
+      </w:r>
+      <w:proofErr w:type="spellStart"/>
+      <w:r>
+        <w:rPr>
+          <w:sz w:val="24"/>
+          <w:rtl/>
+        </w:rPr>
+        <w:t>רג</w:t>
+      </w:r>
+      <w:proofErr w:type="spellEnd"/>
+    </w:p>
+    <w:p>
+      <w:pPr>
+        <w:bidi/>
+      </w:pPr>
+      <w:proofErr w:type="spellStart"/>
+      <w:r>
+        <w:rPr>
+          <w:sz w:val="24"/>
+          <w:rtl/>
+        </w:rPr>
+        <w:t>ת״ז</w:t>
+      </w:r>
+      <w:proofErr w:type="spellEnd"/>
+      <w:r>
+        <w:rPr>
+          <w:sz w:val="24"/>
+          <w:rtl/>
+        </w:rPr>
+        <w:t>: 313393027</w:t>
+      </w:r>
+    </w:p>
+    <w:p>
+      <w:pPr>
+        <w:bidi/>
+      </w:pPr>
+      <w:proofErr w:type="spellStart"/>
+      <w:r>
+        <w:rPr>
+          <w:sz w:val="24"/>
+          <w:rtl/>
+        </w:rPr>
+        <w:t>אימייל</w:t>
+      </w:r>
+      <w:proofErr w:type="spellEnd"/>
+      <w:r>
+        <w:rPr>
+          <w:sz w:val="24"/>
+          <w:rtl/>
+        </w:rPr>
+        <w:t>: amitginz@gmail.com</w:t>
+      </w:r>
+    </w:p>
+    <w:p>
+      <w:pPr>
+        <w:bidi/>
+      </w:pPr>
+      <w:proofErr w:type="spellStart"/>
+      <w:r>
+        <w:rPr>
+          <w:sz w:val="24"/>
+          <w:rtl/>
+        </w:rPr>
+        <w:t>טלפון</w:t>
+      </w:r>
+      <w:proofErr w:type="spellEnd"/>
+      <w:r>
+        <w:rPr>
+          <w:sz w:val="24"/>
+          <w:rtl/>
+        </w:rPr>
+        <w:t>: 054-3192907</w:t>
       </w:r>
     </w:p>
     <w:p>
@@ -54,166 +529,111 @@
       <w:pPr>
         <w:bidi/>
       </w:pPr>
-      <w:r>
-        <w:rPr>
-          <w:b/>
-          <w:color w:val="1E3A5F"/>
-          <w:sz w:val="28"/>
-          <w:rtl/>
-        </w:rPr>
-        <w:t>שותפים בפרויקט</w:t>
-      </w:r>
-    </w:p>
-    <w:p>
-      <w:pPr>
-        <w:jc w:val="right"/>
-      </w:pPr>
-    </w:p>
-    <w:p>
-      <w:pPr>
-        <w:bidi/>
-      </w:pPr>
+      <w:proofErr w:type="spellStart"/>
       <w:r>
         <w:rPr>
           <w:b/>
           <w:sz w:val="24"/>
           <w:rtl/>
         </w:rPr>
-        <w:t>שותף 1</w:t>
+        <w:t>שותף</w:t>
+      </w:r>
+      <w:proofErr w:type="spellEnd"/>
+      <w:r>
+        <w:rPr>
+          <w:b/>
+          <w:sz w:val="24"/>
+          <w:rtl/>
+        </w:rPr>
+        <w:t xml:space="preserve"> 2</w:t>
       </w:r>
     </w:p>
     <w:p>
       <w:pPr>
         <w:bidi/>
       </w:pPr>
+      <w:proofErr w:type="spellStart"/>
       <w:r>
         <w:rPr>
           <w:sz w:val="24"/>
           <w:rtl/>
         </w:rPr>
-        <w:t xml:space="preserve">שם: </w:t>
+        <w:t>שם</w:t>
       </w:r>
-      <w:r>
-        <w:rPr>
-          <w:rFonts w:hint="cs"/>
-          <w:sz w:val="24"/>
-          <w:rtl/>
-          <w:lang w:bidi="he-IL"/>
-        </w:rPr>
-        <w:t>ע</w:t>
-      </w:r>
+      <w:proofErr w:type="spellEnd"/>
       <w:r>
         <w:rPr>
           <w:sz w:val="24"/>
           <w:rtl/>
         </w:rPr>
-        <w:t>מית גינזב</w:t>
+        <w:t xml:space="preserve">: </w:t>
       </w:r>
-      <w:r>
-        <w:rPr>
-          <w:rFonts w:hint="cs"/>
-          <w:sz w:val="24"/>
-          <w:rtl/>
-          <w:lang w:bidi="he-IL"/>
-        </w:rPr>
-        <w:t>ו</w:t>
-      </w:r>
+      <w:proofErr w:type="spellStart"/>
       <w:r>
         <w:rPr>
           <w:sz w:val="24"/>
           <w:rtl/>
         </w:rPr>
-        <w:t>רג</w:t>
+        <w:t>הדר</w:t>
+      </w:r>
+      <w:proofErr w:type="spellEnd"/>
+      <w:r>
+        <w:rPr>
+          <w:sz w:val="24"/>
+          <w:rtl/>
+        </w:rPr>
+        <w:t xml:space="preserve"> </w:t>
+      </w:r>
+      <w:proofErr w:type="spellStart"/>
+      <w:r>
+        <w:rPr>
+          <w:sz w:val="24"/>
+          <w:rtl/>
+        </w:rPr>
+        <w:t>קלר</w:t>
+      </w:r>
+      <w:proofErr w:type="spellEnd"/>
+    </w:p>
+    <w:p>
+      <w:pPr>
+        <w:bidi/>
+      </w:pPr>
+      <w:proofErr w:type="spellStart"/>
+      <w:r>
+        <w:rPr>
+          <w:sz w:val="24"/>
+          <w:rtl/>
+        </w:rPr>
+        <w:t>ת״ז</w:t>
+      </w:r>
+      <w:proofErr w:type="spellEnd"/>
+      <w:r>
+        <w:rPr>
+          <w:sz w:val="24"/>
+          <w:rtl/>
+        </w:rPr>
+        <w:t>: 209825512</w:t>
       </w:r>
     </w:p>
     <w:p>
       <w:pPr>
         <w:bidi/>
       </w:pPr>
+      <w:proofErr w:type="spellStart"/>
       <w:r>
         <w:rPr>
           <w:sz w:val="24"/>
           <w:rtl/>
         </w:rPr>
-        <w:t>ת״ז: 313393027</w:t>
+        <w:t>טלפון</w:t>
       </w:r>
-    </w:p>
-    <w:p>
-      <w:pPr>
-        <w:bidi/>
-      </w:pPr>
+      <w:proofErr w:type="spellEnd"/>
       <w:r>
         <w:rPr>
           <w:sz w:val="24"/>
           <w:rtl/>
         </w:rPr>
-        <w:t>אימייל: amitginz@gmail.com</w:t>
-      </w:r>
-    </w:p>
-    <w:p>
-      <w:pPr>
-        <w:bidi/>
-      </w:pPr>
-      <w:r>
-        <w:rPr>
-          <w:sz w:val="24"/>
-          <w:rtl/>
-        </w:rPr>
-        <w:t>טלפון: 054-3192907</w:t>
-      </w:r>
-    </w:p>
-    <w:p>
-      <w:pPr>
-        <w:jc w:val="right"/>
-      </w:pPr>
-    </w:p>
-    <w:p>
-      <w:pPr>
-        <w:bidi/>
-      </w:pPr>
-      <w:r>
-        <w:rPr>
-          <w:b/>
-          <w:sz w:val="24"/>
-          <w:rtl/>
-        </w:rPr>
-        <w:t>שותף 2</w:t>
-      </w:r>
-    </w:p>
-    <w:p>
-      <w:pPr>
-        <w:bidi/>
-      </w:pPr>
-      <w:r>
-        <w:rPr>
-          <w:sz w:val="24"/>
-          <w:rtl/>
-        </w:rPr>
-        <w:t>שם: הדר קלר</w:t>
-      </w:r>
-    </w:p>
-    <w:p>
-      <w:pPr>
-        <w:bidi/>
-      </w:pPr>
-      <w:r>
-        <w:rPr>
-          <w:sz w:val="24"/>
-          <w:rtl/>
-        </w:rPr>
-        <w:t>ת״ז: 209825512</w:t>
-      </w:r>
-    </w:p>
-    <w:p>
-      <w:pPr>
-        <w:bidi/>
-      </w:pPr>
-      <w:r>
-        <w:rPr>
-          <w:sz w:val="24"/>
-          <w:rtl/>
-        </w:rPr>
-        <w:t>טלפון: 050-7551810</w:t>
+        <w:t>: 050-7551810</w:t>
       </w:r>
     </w:p>
     <w:sectPr>

</xml_diff>